<commit_message>
mise a jour du rapport
</commit_message>
<xml_diff>
--- a/MultiThreading1/rendu/26001721.docx
+++ b/MultiThreading1/rendu/26001721.docx
@@ -1333,7 +1333,19 @@
         <w:rPr>
           <w:lang w:val="en-GB"/>
         </w:rPr>
-        <w:t>In the current situation one way to cause a deadlock is to make the client holds the buffet while wanting to play the piano and then releasing the buffet and vice versa. If the piano is already occupied by 2 client, one client wants to play after eating and one of the clients playing wants to eat the program will be blocked.</w:t>
+        <w:t>In the current situation one way to cause a deadlock is to make the client holds the buffet while wanting to play the piano and then releasing the buffet and vice versa. If the piano is already occupied by 2 client, one client wants to play after eating and one of the clients playing wants to eat</w:t>
+      </w:r>
+      <w:r>
+        <w:rPr>
+          <w:lang w:val="en-GB"/>
+        </w:rPr>
+        <w:t>,</w:t>
+      </w:r>
+      <w:r>
+        <w:rPr>
+          <w:lang w:val="en-GB"/>
+        </w:rPr>
+        <w:t xml:space="preserve"> the program will be blocked.</w:t>
       </w:r>
       <w:r>
         <w:rPr>
@@ -1481,7 +1493,7 @@
         <w:rPr>
           <w:lang w:val="en-GB"/>
         </w:rPr>
-        <w:t xml:space="preserve"> to attain a program with mutual exclusion, no deadlock , no </w:t>
+        <w:t xml:space="preserve"> to attain a program with mutual exclusion, no deadlock , </w:t>
       </w:r>
       <w:proofErr w:type="spellStart"/>
       <w:r>
@@ -1491,6 +1503,12 @@
         <w:t>livelock</w:t>
       </w:r>
       <w:proofErr w:type="spellEnd"/>
+      <w:r>
+        <w:rPr>
+          <w:lang w:val="en-GB"/>
+        </w:rPr>
+        <w:t xml:space="preserve"> avoidance</w:t>
+      </w:r>
       <w:r>
         <w:rPr>
           <w:lang w:val="en-GB"/>
@@ -1704,14 +1722,46 @@
         <w:rPr>
           <w:lang w:val="en-GB"/>
         </w:rPr>
-        <w:t>the Tread’s folder I created 4 classes.</w:t>
+        <w:t xml:space="preserve">the </w:t>
+      </w:r>
+      <w:proofErr w:type="spellStart"/>
+      <w:r>
+        <w:rPr>
+          <w:lang w:val="en-GB"/>
+        </w:rPr>
+        <w:t>workers</w:t>
+      </w:r>
+      <w:r>
+        <w:rPr>
+          <w:lang w:val="en-GB"/>
+        </w:rPr>
+        <w:t>’s</w:t>
+      </w:r>
+      <w:proofErr w:type="spellEnd"/>
+      <w:r>
+        <w:rPr>
+          <w:lang w:val="en-GB"/>
+        </w:rPr>
+        <w:t xml:space="preserve"> folder I created 4 classes.</w:t>
       </w:r>
       <w:r>
         <w:rPr>
           <w:lang w:val="en-GB"/>
         </w:rPr>
         <w:br/>
-        <w:t xml:space="preserve">The first class “InputRunnable.java” is here to capture when the user write something in the console and to transform this input into either a </w:t>
+        <w:t>The first class “InputRunnable.java” is here to capture when the user write something in the console</w:t>
+      </w:r>
+      <w:r>
+        <w:rPr>
+          <w:lang w:val="en-GB"/>
+        </w:rPr>
+        <w:t xml:space="preserve"> or the GUI</w:t>
+      </w:r>
+      <w:r>
+        <w:rPr>
+          <w:lang w:val="en-GB"/>
+        </w:rPr>
+        <w:t xml:space="preserve"> and to transform this input into either a </w:t>
       </w:r>
       <w:proofErr w:type="spellStart"/>
       <w:r>
@@ -1772,7 +1822,33 @@
           <w:lang w:val="en-GB"/>
         </w:rPr>
         <w:br/>
-        <w:t xml:space="preserve">The second class “WriterRunnable.java” is responsible to write message on the console to do that it uses the write method of the </w:t>
+        <w:t xml:space="preserve">The second class “WriterRunnable.java” is responsible to write message on the </w:t>
+      </w:r>
+      <w:proofErr w:type="gramStart"/>
+      <w:r>
+        <w:rPr>
+          <w:lang w:val="en-GB"/>
+        </w:rPr>
+        <w:t xml:space="preserve">console </w:t>
+      </w:r>
+      <w:r>
+        <w:rPr>
+          <w:lang w:val="en-GB"/>
+        </w:rPr>
+        <w:t xml:space="preserve"> or</w:t>
+      </w:r>
+      <w:proofErr w:type="gramEnd"/>
+      <w:r>
+        <w:rPr>
+          <w:lang w:val="en-GB"/>
+        </w:rPr>
+        <w:t xml:space="preserve"> on the GUI </w:t>
+      </w:r>
+      <w:r>
+        <w:rPr>
+          <w:lang w:val="en-GB"/>
+        </w:rPr>
+        <w:t xml:space="preserve">to do that it uses the write method of the </w:t>
       </w:r>
       <w:proofErr w:type="spellStart"/>
       <w:r>
@@ -2077,13 +2153,125 @@
         <w:rPr>
           <w:lang w:val="en-GB"/>
         </w:rPr>
-        <w:t xml:space="preserve">In the main class I first initialize my number and time generator then I introduce 2 blocking Queue to store all the events. These 2 blocking Queue are BlockingQueue&lt;&gt; interface implemented by the type </w:t>
+        <w:t>As for the IO’s folder I created 4 class and 2 interfaces. These interfaces are used in the writer or input thread to save the information about the input source and the output destination. The 4 classes implement the 2 interfaces and are either for the GUI or the console.</w:t>
+      </w:r>
+    </w:p>
+    <w:p>
+      <w:pPr>
+        <w:rPr>
+          <w:lang w:val="en-GB"/>
+        </w:rPr>
+      </w:pPr>
+    </w:p>
+    <w:p>
+      <w:pPr>
+        <w:rPr>
+          <w:lang w:val="en-GB"/>
+        </w:rPr>
+      </w:pPr>
+      <w:r>
+        <w:rPr>
+          <w:lang w:val="en-GB"/>
+        </w:rPr>
+        <w:t xml:space="preserve">As for the GUI’s folder there is 3 classes 1 to create a custom panel and two others to create custom frame. The custom frame are an Initialisation frame and a simulation frame. The initialisation frame </w:t>
+      </w:r>
+      <w:r>
+        <w:rPr>
+          <w:lang w:val="en-GB"/>
+        </w:rPr>
+        <w:t>initializes</w:t>
+      </w:r>
+      <w:r>
+        <w:rPr>
+          <w:lang w:val="en-GB"/>
+        </w:rPr>
+        <w:t xml:space="preserve"> the simulation </w:t>
+      </w:r>
+      <w:r>
+        <w:rPr>
+          <w:lang w:val="en-GB"/>
+        </w:rPr>
+        <w:t xml:space="preserve">by defining the number of staff, </w:t>
+      </w:r>
+      <w:r>
+        <w:rPr>
+          <w:lang w:val="en-GB"/>
+        </w:rPr>
+        <w:lastRenderedPageBreak/>
+        <w:t xml:space="preserve">clients, tea, coffee and cake. Then it runs the </w:t>
       </w:r>
       <w:proofErr w:type="spellStart"/>
       <w:r>
         <w:rPr>
           <w:lang w:val="en-GB"/>
         </w:rPr>
+        <w:t>MainFrame</w:t>
+      </w:r>
+      <w:proofErr w:type="spellEnd"/>
+      <w:r>
+        <w:rPr>
+          <w:lang w:val="en-GB"/>
+        </w:rPr>
+        <w:t xml:space="preserve"> to start the simulation.</w:t>
+      </w:r>
+      <w:r>
+        <w:rPr>
+          <w:lang w:val="en-GB"/>
+        </w:rPr>
+        <w:br/>
+        <w:t xml:space="preserve">The </w:t>
+      </w:r>
+      <w:proofErr w:type="spellStart"/>
+      <w:r>
+        <w:rPr>
+          <w:lang w:val="en-GB"/>
+        </w:rPr>
+        <w:t>MainFrame</w:t>
+      </w:r>
+      <w:proofErr w:type="spellEnd"/>
+      <w:r>
+        <w:rPr>
+          <w:lang w:val="en-GB"/>
+        </w:rPr>
+        <w:t xml:space="preserve"> runs the simulation and print several information about the simulation.</w:t>
+      </w:r>
+    </w:p>
+    <w:p>
+      <w:pPr>
+        <w:rPr>
+          <w:lang w:val="en-GB"/>
+        </w:rPr>
+      </w:pPr>
+    </w:p>
+    <w:p>
+      <w:pPr>
+        <w:rPr>
+          <w:lang w:val="en-GB"/>
+        </w:rPr>
+      </w:pPr>
+      <w:r>
+        <w:rPr>
+          <w:lang w:val="en-GB"/>
+        </w:rPr>
+        <w:t xml:space="preserve">In the main class </w:t>
+      </w:r>
+      <w:r>
+        <w:rPr>
+          <w:lang w:val="en-GB"/>
+        </w:rPr>
+        <w:t xml:space="preserve">I implemented the console version of the simulation. To do that </w:t>
+      </w:r>
+      <w:r>
+        <w:rPr>
+          <w:lang w:val="en-GB"/>
+        </w:rPr>
+        <w:t xml:space="preserve">I first initialize my number and time generator then I introduce 2 blocking Queue to store all the events. These 2 blocking Queue are BlockingQueue&lt;&gt; interface implemented by the type </w:t>
+      </w:r>
+      <w:proofErr w:type="spellStart"/>
+      <w:r>
+        <w:rPr>
+          <w:lang w:val="en-GB"/>
+        </w:rPr>
         <w:t>LinkedBlockingQueue</w:t>
       </w:r>
       <w:proofErr w:type="spellEnd"/>
@@ -2136,168 +2324,220 @@
         <w:rPr>
           <w:lang w:val="en-GB"/>
         </w:rPr>
+        <w:t xml:space="preserve">I used a method </w:t>
+      </w:r>
+      <w:proofErr w:type="gramStart"/>
+      <w:r>
+        <w:rPr>
+          <w:lang w:val="en-GB"/>
+        </w:rPr>
+        <w:t>Init(</w:t>
+      </w:r>
+      <w:proofErr w:type="gramEnd"/>
+      <w:r>
+        <w:rPr>
+          <w:lang w:val="en-GB"/>
+        </w:rPr>
+        <w:t>) to initialize the simulation without using thread because to initialize the output thread I need to initialize the buffet.</w:t>
+      </w:r>
+    </w:p>
+    <w:p>
+      <w:pPr>
+        <w:rPr>
+          <w:lang w:val="en-GB"/>
+        </w:rPr>
+      </w:pPr>
+      <w:r>
+        <w:rPr>
+          <w:lang w:val="en-GB"/>
+        </w:rPr>
+        <w:t xml:space="preserve">To store the client and the staff I used two vectors of thread because the vector can access, delete and add new element in an efficient way and the vector synchronized access to its data for every single method so there is no need </w:t>
+      </w:r>
+      <w:r>
+        <w:rPr>
+          <w:lang w:val="en-GB"/>
+        </w:rPr>
+        <w:t xml:space="preserve">to synchronize these 2 vectors when adding new threads (Vector synchronized). </w:t>
+      </w:r>
+    </w:p>
+    <w:p>
+      <w:pPr>
+        <w:rPr>
+          <w:lang w:val="en-GB"/>
+        </w:rPr>
+      </w:pPr>
+      <w:r>
+        <w:rPr>
+          <w:lang w:val="en-GB"/>
+        </w:rPr>
+        <w:t xml:space="preserve">After that I initialize every vector and the buffet with the value the user wants I used my input event to control the </w:t>
+      </w:r>
+      <w:r>
+        <w:rPr>
+          <w:lang w:val="en-GB"/>
+        </w:rPr>
+        <w:t>console</w:t>
+      </w:r>
+      <w:r>
+        <w:rPr>
+          <w:lang w:val="en-GB"/>
+        </w:rPr>
+        <w:t>.</w:t>
+      </w:r>
+    </w:p>
+    <w:p>
+      <w:pPr>
+        <w:rPr>
+          <w:lang w:val="en-GB"/>
+        </w:rPr>
+      </w:pPr>
+      <w:r>
+        <w:rPr>
+          <w:lang w:val="en-GB"/>
+        </w:rPr>
+        <w:t xml:space="preserve">As for the quit event I </w:t>
+      </w:r>
+      <w:r>
+        <w:rPr>
+          <w:lang w:val="en-GB"/>
+        </w:rPr>
+        <w:t xml:space="preserve">interrupt every thread I am using (input thread, output thread, staff’s thread, client’s thread) and to ensure that every thread is interrupted at the end of the program I use the join method on all the thread. And </w:t>
+      </w:r>
+      <w:r>
+        <w:rPr>
+          <w:lang w:val="en-GB"/>
+        </w:rPr>
+        <w:t>finally,</w:t>
+      </w:r>
+      <w:r>
+        <w:rPr>
+          <w:lang w:val="en-GB"/>
+        </w:rPr>
+        <w:t xml:space="preserve"> I turn the running variable to false to avoid staying in the simulation loop.</w:t>
+      </w:r>
+      <w:r>
+        <w:rPr>
+          <w:lang w:val="en-GB"/>
+        </w:rPr>
+        <w:br/>
+      </w:r>
+    </w:p>
+    <w:p>
+      <w:pPr>
+        <w:rPr>
+          <w:lang w:val="en-GB"/>
+        </w:rPr>
+      </w:pPr>
+      <w:r>
+        <w:rPr>
+          <w:lang w:val="en-GB"/>
+        </w:rPr>
+        <w:t xml:space="preserve">In the </w:t>
+      </w:r>
+      <w:proofErr w:type="spellStart"/>
+      <w:r>
+        <w:rPr>
+          <w:lang w:val="en-GB"/>
+        </w:rPr>
+        <w:t>mainGUI</w:t>
+      </w:r>
+      <w:proofErr w:type="spellEnd"/>
+      <w:r>
+        <w:rPr>
+          <w:lang w:val="en-GB"/>
+        </w:rPr>
+        <w:t xml:space="preserve"> class I implemented the GUI of the simulation. To do that I only call the initialization frame the run method of a thread.</w:t>
+      </w:r>
+    </w:p>
+    <w:p>
+      <w:pPr>
+        <w:rPr>
+          <w:lang w:val="en-GB"/>
+        </w:rPr>
+      </w:pPr>
+      <w:r>
+        <w:rPr>
+          <w:lang w:val="en-GB"/>
+        </w:rPr>
+        <w:br/>
+      </w:r>
+      <w:r>
+        <w:rPr>
+          <w:lang w:val="en-GB"/>
+        </w:rPr>
+        <w:t>The shared resources are the buffet, the piano the command Queue and the output Queue.</w:t>
+      </w:r>
+    </w:p>
+    <w:p>
+      <w:pPr>
+        <w:rPr>
+          <w:lang w:val="en-GB"/>
+        </w:rPr>
+      </w:pPr>
+      <w:r>
+        <w:rPr>
+          <w:lang w:val="en-GB"/>
+        </w:rPr>
+        <w:t xml:space="preserve">To ensure the mutual exclusion on the buffet I used the keyword synchronized for the staff’s thread and a </w:t>
+      </w:r>
+      <w:proofErr w:type="spellStart"/>
+      <w:r>
+        <w:rPr>
+          <w:lang w:val="en-GB"/>
+        </w:rPr>
+        <w:t>reentrant</w:t>
+      </w:r>
+      <w:proofErr w:type="spellEnd"/>
+      <w:r>
+        <w:rPr>
+          <w:lang w:val="en-GB"/>
+        </w:rPr>
+        <w:t xml:space="preserve"> lock </w:t>
+      </w:r>
+      <w:r>
+        <w:rPr>
+          <w:lang w:val="en-GB"/>
+        </w:rPr>
+        <w:t xml:space="preserve">with fairness </w:t>
+      </w:r>
+      <w:r>
+        <w:rPr>
+          <w:lang w:val="en-GB"/>
+        </w:rPr>
+        <w:t xml:space="preserve">for the client’s thread. I used the keyword synchronized for the staff’s thread </w:t>
+      </w:r>
+      <w:r>
+        <w:rPr>
+          <w:lang w:val="en-GB"/>
+        </w:rPr>
+        <w:t xml:space="preserve">because the staff just need to add some product to the buffet which is a very fast operation so implementing fairness will not be significant. I used a </w:t>
+      </w:r>
+      <w:proofErr w:type="spellStart"/>
+      <w:r>
+        <w:rPr>
+          <w:lang w:val="en-GB"/>
+        </w:rPr>
+        <w:t>reentrant</w:t>
+      </w:r>
+      <w:proofErr w:type="spellEnd"/>
+      <w:r>
+        <w:rPr>
+          <w:lang w:val="en-GB"/>
+        </w:rPr>
+        <w:t xml:space="preserve"> lock with fairness for the client’s thread because the client might have the lock on the buffet a lot more time than the staff. And in a cafe </w:t>
+      </w:r>
+      <w:r>
+        <w:rPr>
+          <w:lang w:val="en-GB"/>
+        </w:rPr>
+        <w:t xml:space="preserve">the </w:t>
+      </w:r>
+      <w:r>
+        <w:rPr>
+          <w:lang w:val="en-GB"/>
+        </w:rPr>
         <w:lastRenderedPageBreak/>
-        <w:t xml:space="preserve">I used a method </w:t>
-      </w:r>
-      <w:proofErr w:type="gramStart"/>
-      <w:r>
-        <w:rPr>
-          <w:lang w:val="en-GB"/>
-        </w:rPr>
-        <w:t>Init(</w:t>
-      </w:r>
-      <w:proofErr w:type="gramEnd"/>
-      <w:r>
-        <w:rPr>
-          <w:lang w:val="en-GB"/>
-        </w:rPr>
-        <w:t>) to initialize the simulation without using thread because to initialize the output thread I need to initialize the buffet.</w:t>
-      </w:r>
-    </w:p>
-    <w:p>
-      <w:pPr>
-        <w:rPr>
-          <w:lang w:val="en-GB"/>
-        </w:rPr>
-      </w:pPr>
-      <w:r>
-        <w:rPr>
-          <w:lang w:val="en-GB"/>
-        </w:rPr>
-        <w:t xml:space="preserve">To store the client and the staff I used two vectors of thread because the vector can access, delete and add new element in an efficient way and the vector synchronized access to its data for every single method so there is no need </w:t>
-      </w:r>
-      <w:r>
-        <w:rPr>
-          <w:lang w:val="en-GB"/>
-        </w:rPr>
-        <w:t xml:space="preserve">to synchronize these 2 vectors when adding new threads (Vector synchronized). </w:t>
-      </w:r>
-    </w:p>
-    <w:p>
-      <w:pPr>
-        <w:rPr>
-          <w:lang w:val="en-GB"/>
-        </w:rPr>
-      </w:pPr>
-      <w:r>
-        <w:rPr>
-          <w:lang w:val="en-GB"/>
-        </w:rPr>
-        <w:t>After that I initialize every vector and the buffet with the value the user wants I used my input event to control the GUI.</w:t>
-      </w:r>
-    </w:p>
-    <w:p>
-      <w:pPr>
-        <w:rPr>
-          <w:lang w:val="en-GB"/>
-        </w:rPr>
-      </w:pPr>
-      <w:r>
-        <w:rPr>
-          <w:lang w:val="en-GB"/>
-        </w:rPr>
-        <w:t xml:space="preserve">As for the quit event I </w:t>
-      </w:r>
-      <w:r>
-        <w:rPr>
-          <w:lang w:val="en-GB"/>
-        </w:rPr>
-        <w:t xml:space="preserve">interrupt every thread I am using (input thread, output thread, staff’s thread, client’s thread) and to ensure that every thread is interrupted at the end of the program I use the join method on all the thread. And </w:t>
-      </w:r>
-      <w:r>
-        <w:rPr>
-          <w:lang w:val="en-GB"/>
-        </w:rPr>
-        <w:t>finally,</w:t>
-      </w:r>
-      <w:r>
-        <w:rPr>
-          <w:lang w:val="en-GB"/>
-        </w:rPr>
-        <w:t xml:space="preserve"> I turn the running variable to false to avoid staying in the simulation loop.</w:t>
-      </w:r>
-      <w:r>
-        <w:rPr>
-          <w:lang w:val="en-GB"/>
-        </w:rPr>
-        <w:br/>
-      </w:r>
-      <w:r>
-        <w:rPr>
-          <w:lang w:val="en-GB"/>
-        </w:rPr>
-        <w:br/>
-      </w:r>
-      <w:r>
-        <w:rPr>
-          <w:lang w:val="en-GB"/>
-        </w:rPr>
-        <w:t>The shared resources are the buffet, the piano the command Queue and the output Queue.</w:t>
-      </w:r>
-    </w:p>
-    <w:p>
-      <w:pPr>
-        <w:rPr>
-          <w:lang w:val="en-GB"/>
-        </w:rPr>
-      </w:pPr>
-      <w:r>
-        <w:rPr>
-          <w:lang w:val="en-GB"/>
-        </w:rPr>
-        <w:t xml:space="preserve">To ensure the mutual exclusion on the buffet I used the keyword synchronized for the staff’s thread and a </w:t>
-      </w:r>
-      <w:proofErr w:type="spellStart"/>
-      <w:r>
-        <w:rPr>
-          <w:lang w:val="en-GB"/>
-        </w:rPr>
-        <w:t>reentrant</w:t>
-      </w:r>
-      <w:proofErr w:type="spellEnd"/>
-      <w:r>
-        <w:rPr>
-          <w:lang w:val="en-GB"/>
-        </w:rPr>
-        <w:t xml:space="preserve"> lock </w:t>
-      </w:r>
-      <w:r>
-        <w:rPr>
-          <w:lang w:val="en-GB"/>
-        </w:rPr>
-        <w:t xml:space="preserve">with fairness </w:t>
-      </w:r>
-      <w:r>
-        <w:rPr>
-          <w:lang w:val="en-GB"/>
-        </w:rPr>
-        <w:t xml:space="preserve">for the client’s thread. I used the keyword synchronized for the staff’s thread </w:t>
-      </w:r>
-      <w:r>
-        <w:rPr>
-          <w:lang w:val="en-GB"/>
-        </w:rPr>
-        <w:t xml:space="preserve">because the staff just need to add some product to the buffet which is a very fast operation so implementing fairness will not be significant. I used a </w:t>
-      </w:r>
-      <w:proofErr w:type="spellStart"/>
-      <w:r>
-        <w:rPr>
-          <w:lang w:val="en-GB"/>
-        </w:rPr>
-        <w:t>reentrant</w:t>
-      </w:r>
-      <w:proofErr w:type="spellEnd"/>
-      <w:r>
-        <w:rPr>
-          <w:lang w:val="en-GB"/>
-        </w:rPr>
-        <w:t xml:space="preserve"> lock with fairness for the client’s thread because the client might have the lock on the buffet a lot more time than the staff. And in a cafe </w:t>
-      </w:r>
-      <w:r>
-        <w:rPr>
-          <w:lang w:val="en-GB"/>
-        </w:rPr>
-        <w:t>the customer is king so it’s best if a staff wait to bring more items in the buffet than a client who needs to wait for the buffet to be available while having enough items.</w:t>
+        <w:t>customer is king so it’s best if a staff wait to bring more items in the buffet than a client who needs to wait for the buffet to be available while having enough items.</w:t>
       </w:r>
     </w:p>
     <w:p>
@@ -2437,7 +2677,6 @@
         <w:rPr>
           <w:lang w:val="en-GB"/>
         </w:rPr>
-        <w:lastRenderedPageBreak/>
         <w:t>T</w:t>
       </w:r>
       <w:r>
@@ -2470,7 +2709,59 @@
         <w:rPr>
           <w:lang w:val="en-GB"/>
         </w:rPr>
-        <w:t xml:space="preserve">when the piano or the buffet is unavailable the client’s thread keep the lock on the shared resource.  So, a situation of </w:t>
+        <w:t>when the piano or the buffet is unavailable the client’s thread keep the lock on the shared resource.</w:t>
+      </w:r>
+      <w:r>
+        <w:rPr>
+          <w:lang w:val="en-GB"/>
+        </w:rPr>
+        <w:t xml:space="preserve"> Also, another </w:t>
+      </w:r>
+      <w:proofErr w:type="spellStart"/>
+      <w:r>
+        <w:rPr>
+          <w:lang w:val="en-GB"/>
+        </w:rPr>
+        <w:t>livelock</w:t>
+      </w:r>
+      <w:proofErr w:type="spellEnd"/>
+      <w:r>
+        <w:rPr>
+          <w:lang w:val="en-GB"/>
+        </w:rPr>
+        <w:t xml:space="preserve"> source is from the staff, they are assigned a product they can only produce, so</w:t>
+      </w:r>
+      <w:r>
+        <w:rPr>
+          <w:lang w:val="en-GB"/>
+        </w:rPr>
+        <w:t xml:space="preserve"> </w:t>
+      </w:r>
+      <w:r>
+        <w:rPr>
+          <w:lang w:val="en-GB"/>
+        </w:rPr>
+        <w:t xml:space="preserve">if the number of staff is lesser than the number of products a </w:t>
+      </w:r>
+      <w:proofErr w:type="spellStart"/>
+      <w:r>
+        <w:rPr>
+          <w:lang w:val="en-GB"/>
+        </w:rPr>
+        <w:t>livelock</w:t>
+      </w:r>
+      <w:proofErr w:type="spellEnd"/>
+      <w:r>
+        <w:rPr>
+          <w:lang w:val="en-GB"/>
+        </w:rPr>
+        <w:t xml:space="preserve"> will be happening because of the lack of items on the buffet. To avoid this, I set the number of staff at a minimum of 3. </w:t>
+      </w:r>
+      <w:r>
+        <w:rPr>
+          <w:lang w:val="en-GB"/>
+        </w:rPr>
+        <w:t xml:space="preserve"> So, a situation of </w:t>
       </w:r>
       <w:proofErr w:type="spellStart"/>
       <w:r>
@@ -2660,13 +2951,7 @@
         <w:rPr>
           <w:lang w:val="en-GB"/>
         </w:rPr>
-        <w:t>Doc BlockingQueue</w:t>
-      </w:r>
-      <w:r>
-        <w:rPr>
-          <w:lang w:val="en-GB"/>
-        </w:rPr>
-        <w:t xml:space="preserve"> </w:t>
+        <w:t xml:space="preserve">Doc BlockingQueue </w:t>
       </w:r>
       <w:hyperlink r:id="rId10" w:history="1">
         <w:r>

</xml_diff>

<commit_message>
ajout des reference au rapport et regeneration du pdf
</commit_message>
<xml_diff>
--- a/MultiThreading1/rendu/26001721.docx
+++ b/MultiThreading1/rendu/26001721.docx
@@ -1590,7 +1590,33 @@
         <w:rPr>
           <w:lang w:val="en-GB"/>
         </w:rPr>
-        <w:t xml:space="preserve"> with fairness</w:t>
+        <w:t xml:space="preserve"> </w:t>
+      </w:r>
+      <w:r>
+        <w:rPr>
+          <w:lang w:val="en-GB"/>
+        </w:rPr>
+        <w:t xml:space="preserve">(doc </w:t>
+      </w:r>
+      <w:proofErr w:type="spellStart"/>
+      <w:r>
+        <w:rPr>
+          <w:lang w:val="en-GB"/>
+        </w:rPr>
+        <w:t>JavaRentrantLock</w:t>
+      </w:r>
+      <w:proofErr w:type="spellEnd"/>
+      <w:r>
+        <w:rPr>
+          <w:lang w:val="en-GB"/>
+        </w:rPr>
+        <w:t xml:space="preserve">) </w:t>
+      </w:r>
+      <w:r>
+        <w:rPr>
+          <w:lang w:val="en-GB"/>
+        </w:rPr>
+        <w:t>with fairness</w:t>
       </w:r>
       <w:r>
         <w:rPr>
@@ -1824,20 +1850,12 @@
         <w:br/>
         <w:t xml:space="preserve">The second class “WriterRunnable.java” is responsible to write message on the </w:t>
       </w:r>
-      <w:proofErr w:type="gramStart"/>
-      <w:r>
-        <w:rPr>
-          <w:lang w:val="en-GB"/>
-        </w:rPr>
-        <w:t xml:space="preserve">console </w:t>
-      </w:r>
-      <w:r>
-        <w:rPr>
-          <w:lang w:val="en-GB"/>
-        </w:rPr>
-        <w:t xml:space="preserve"> or</w:t>
-      </w:r>
-      <w:proofErr w:type="gramEnd"/>
+      <w:r>
+        <w:rPr>
+          <w:lang w:val="en-GB"/>
+        </w:rPr>
+        <w:t>console or</w:t>
+      </w:r>
       <w:r>
         <w:rPr>
           <w:lang w:val="en-GB"/>
@@ -2155,6 +2173,191 @@
         </w:rPr>
         <w:t>As for the IO’s folder I created 4 class and 2 interfaces. These interfaces are used in the writer or input thread to save the information about the input source and the output destination. The 4 classes implement the 2 interfaces and are either for the GUI or the console.</w:t>
       </w:r>
+      <w:r>
+        <w:rPr>
+          <w:lang w:val="en-GB"/>
+        </w:rPr>
+        <w:t xml:space="preserve"> For the </w:t>
+      </w:r>
+      <w:proofErr w:type="spellStart"/>
+      <w:r>
+        <w:rPr>
+          <w:lang w:val="en-GB"/>
+        </w:rPr>
+        <w:t>consoleInput</w:t>
+      </w:r>
+      <w:r>
+        <w:rPr>
+          <w:lang w:val="en-GB"/>
+        </w:rPr>
+        <w:t>Source</w:t>
+      </w:r>
+      <w:proofErr w:type="spellEnd"/>
+      <w:r>
+        <w:rPr>
+          <w:lang w:val="en-GB"/>
+        </w:rPr>
+        <w:t xml:space="preserve"> class, an implementation of the </w:t>
+      </w:r>
+      <w:proofErr w:type="spellStart"/>
+      <w:r>
+        <w:rPr>
+          <w:lang w:val="en-GB"/>
+        </w:rPr>
+        <w:t>inputSource</w:t>
+      </w:r>
+      <w:proofErr w:type="spellEnd"/>
+      <w:r>
+        <w:rPr>
+          <w:lang w:val="en-GB"/>
+        </w:rPr>
+        <w:t xml:space="preserve"> interface, I used the Scanner class to read something from the console. For the </w:t>
+      </w:r>
+      <w:proofErr w:type="spellStart"/>
+      <w:r>
+        <w:rPr>
+          <w:lang w:val="en-GB"/>
+        </w:rPr>
+        <w:t>consoleOutput</w:t>
+      </w:r>
+      <w:proofErr w:type="spellEnd"/>
+      <w:r>
+        <w:rPr>
+          <w:lang w:val="en-GB"/>
+        </w:rPr>
+        <w:t xml:space="preserve"> Dest I only used standard library. For the </w:t>
+      </w:r>
+      <w:proofErr w:type="spellStart"/>
+      <w:r>
+        <w:rPr>
+          <w:lang w:val="en-GB"/>
+        </w:rPr>
+        <w:t>GUIInputSource</w:t>
+      </w:r>
+      <w:proofErr w:type="spellEnd"/>
+      <w:r>
+        <w:rPr>
+          <w:lang w:val="en-GB"/>
+        </w:rPr>
+        <w:t xml:space="preserve"> I used a </w:t>
+      </w:r>
+      <w:proofErr w:type="spellStart"/>
+      <w:r>
+        <w:rPr>
+          <w:lang w:val="en-GB"/>
+        </w:rPr>
+        <w:t>blockingQueue</w:t>
+      </w:r>
+      <w:proofErr w:type="spellEnd"/>
+      <w:r>
+        <w:rPr>
+          <w:lang w:val="en-GB"/>
+        </w:rPr>
+        <w:t xml:space="preserve"> (</w:t>
+      </w:r>
+      <w:r>
+        <w:rPr>
+          <w:lang w:val="en-GB"/>
+        </w:rPr>
+        <w:t>Doc BlockingQueue</w:t>
+      </w:r>
+      <w:r>
+        <w:rPr>
+          <w:lang w:val="en-GB"/>
+        </w:rPr>
+        <w:t xml:space="preserve">) to save the message wrote in a </w:t>
+      </w:r>
+      <w:proofErr w:type="spellStart"/>
+      <w:r>
+        <w:rPr>
+          <w:lang w:val="en-GB"/>
+        </w:rPr>
+        <w:t>JTextField</w:t>
+      </w:r>
+      <w:proofErr w:type="spellEnd"/>
+      <w:r>
+        <w:rPr>
+          <w:lang w:val="en-GB"/>
+        </w:rPr>
+        <w:t xml:space="preserve"> (</w:t>
+      </w:r>
+      <w:r>
+        <w:rPr>
+          <w:lang w:val="en-GB"/>
+        </w:rPr>
+        <w:t xml:space="preserve">Doc Java </w:t>
+      </w:r>
+      <w:proofErr w:type="spellStart"/>
+      <w:r>
+        <w:rPr>
+          <w:lang w:val="en-GB"/>
+        </w:rPr>
+        <w:t>JTextField</w:t>
+      </w:r>
+      <w:proofErr w:type="spellEnd"/>
+      <w:r>
+        <w:rPr>
+          <w:lang w:val="en-GB"/>
+        </w:rPr>
+        <w:t xml:space="preserve">). For the </w:t>
+      </w:r>
+      <w:proofErr w:type="spellStart"/>
+      <w:r>
+        <w:rPr>
+          <w:lang w:val="en-GB"/>
+        </w:rPr>
+        <w:t>GUIOutputDest</w:t>
+      </w:r>
+      <w:proofErr w:type="spellEnd"/>
+      <w:r>
+        <w:rPr>
+          <w:lang w:val="en-GB"/>
+        </w:rPr>
+        <w:t xml:space="preserve"> I used a </w:t>
+      </w:r>
+      <w:proofErr w:type="spellStart"/>
+      <w:proofErr w:type="gramStart"/>
+      <w:r>
+        <w:rPr>
+          <w:lang w:val="en-GB"/>
+        </w:rPr>
+        <w:t>JTextArea</w:t>
+      </w:r>
+      <w:proofErr w:type="spellEnd"/>
+      <w:r>
+        <w:rPr>
+          <w:lang w:val="en-GB"/>
+        </w:rPr>
+        <w:t>(</w:t>
+      </w:r>
+      <w:proofErr w:type="gramEnd"/>
+      <w:r>
+        <w:rPr>
+          <w:lang w:val="en-GB"/>
+        </w:rPr>
+        <w:t xml:space="preserve">Doc Java </w:t>
+      </w:r>
+      <w:proofErr w:type="spellStart"/>
+      <w:r>
+        <w:rPr>
+          <w:lang w:val="en-GB"/>
+        </w:rPr>
+        <w:t>JTextArea</w:t>
+      </w:r>
+      <w:proofErr w:type="spellEnd"/>
+      <w:r>
+        <w:rPr>
+          <w:lang w:val="en-GB"/>
+        </w:rPr>
+        <w:t>) and then append the String with the message on this area.</w:t>
+      </w:r>
+    </w:p>
+    <w:p>
+      <w:pPr>
+        <w:rPr>
+          <w:lang w:val="en-GB"/>
+        </w:rPr>
+      </w:pPr>
     </w:p>
     <w:p>
       <w:pPr>
@@ -2191,14 +2394,7 @@
         <w:rPr>
           <w:lang w:val="en-GB"/>
         </w:rPr>
-        <w:t xml:space="preserve">by defining the number of staff, </w:t>
-      </w:r>
-      <w:r>
-        <w:rPr>
-          <w:lang w:val="en-GB"/>
-        </w:rPr>
-        <w:lastRenderedPageBreak/>
-        <w:t xml:space="preserve">clients, tea, coffee and cake. Then it runs the </w:t>
+        <w:t xml:space="preserve">by defining the number of staff, clients, tea, coffee and cake. Then it runs the </w:t>
       </w:r>
       <w:proofErr w:type="spellStart"/>
       <w:r>
@@ -2235,6 +2431,32 @@
         </w:rPr>
         <w:t xml:space="preserve"> runs the simulation and print several information about the simulation.</w:t>
       </w:r>
+      <w:r>
+        <w:rPr>
+          <w:lang w:val="en-GB"/>
+        </w:rPr>
+        <w:t xml:space="preserve"> For all the classes in this folder I used the code of a lab (</w:t>
+      </w:r>
+      <w:r>
+        <w:rPr>
+          <w:lang w:val="en-GB"/>
+        </w:rPr>
+        <w:t xml:space="preserve">Lab 5 Dr Daniele </w:t>
+      </w:r>
+      <w:proofErr w:type="spellStart"/>
+      <w:r>
+        <w:rPr>
+          <w:lang w:val="en-GB"/>
+        </w:rPr>
+        <w:t>Scrimieri</w:t>
+      </w:r>
+      <w:proofErr w:type="spellEnd"/>
+      <w:r>
+        <w:rPr>
+          <w:lang w:val="en-GB"/>
+        </w:rPr>
+        <w:t>) as a base.</w:t>
+      </w:r>
     </w:p>
     <w:p>
       <w:pPr>
@@ -2265,7 +2487,19 @@
         <w:rPr>
           <w:lang w:val="en-GB"/>
         </w:rPr>
-        <w:t xml:space="preserve">I first initialize my number and time generator then I introduce 2 blocking Queue to store all the events. These 2 blocking Queue are BlockingQueue&lt;&gt; interface implemented by the type </w:t>
+        <w:t>I first initialize my number and time generator then I introduce 2 blocking Queue to store all the events. These 2 blocking Queue are BlockingQueue&lt;&gt;</w:t>
+      </w:r>
+      <w:r>
+        <w:rPr>
+          <w:lang w:val="en-GB"/>
+        </w:rPr>
+        <w:t xml:space="preserve"> (Doc BlockingQueue)</w:t>
+      </w:r>
+      <w:r>
+        <w:rPr>
+          <w:lang w:val="en-GB"/>
+        </w:rPr>
+        <w:t xml:space="preserve"> interface implemented by the type </w:t>
       </w:r>
       <w:proofErr w:type="spellStart"/>
       <w:r>
@@ -2478,6 +2712,7 @@
         <w:rPr>
           <w:lang w:val="en-GB"/>
         </w:rPr>
+        <w:lastRenderedPageBreak/>
         <w:t xml:space="preserve">To ensure the mutual exclusion on the buffet I used the keyword synchronized for the staff’s thread and a </w:t>
       </w:r>
       <w:proofErr w:type="spellStart"/>
@@ -2498,6 +2733,26 @@
         <w:rPr>
           <w:lang w:val="en-GB"/>
         </w:rPr>
+        <w:t xml:space="preserve">(Doc </w:t>
+      </w:r>
+      <w:proofErr w:type="spellStart"/>
+      <w:r>
+        <w:rPr>
+          <w:lang w:val="en-GB"/>
+        </w:rPr>
+        <w:t>JavaReentrantLock</w:t>
+      </w:r>
+      <w:proofErr w:type="spellEnd"/>
+      <w:r>
+        <w:rPr>
+          <w:lang w:val="en-GB"/>
+        </w:rPr>
+        <w:t xml:space="preserve">) </w:t>
+      </w:r>
+      <w:r>
+        <w:rPr>
+          <w:lang w:val="en-GB"/>
+        </w:rPr>
         <w:t xml:space="preserve">with fairness </w:t>
       </w:r>
       <w:r>
@@ -2530,14 +2785,7 @@
         <w:rPr>
           <w:lang w:val="en-GB"/>
         </w:rPr>
-        <w:t xml:space="preserve">the </w:t>
-      </w:r>
-      <w:r>
-        <w:rPr>
-          <w:lang w:val="en-GB"/>
-        </w:rPr>
-        <w:lastRenderedPageBreak/>
-        <w:t>customer is king so it’s best if a staff wait to bring more items in the buffet than a client who needs to wait for the buffet to be available while having enough items.</w:t>
+        <w:t>the customer is king so it’s best if a staff wait to bring more items in the buffet than a client who needs to wait for the buffet to be available while having enough items.</w:t>
       </w:r>
     </w:p>
     <w:p>
@@ -2962,6 +3210,148 @@
           <w:t>https://docs.oracle.com/javase/8/docs/api/java/util/concurrent/BlockingQueue.html</w:t>
         </w:r>
       </w:hyperlink>
+    </w:p>
+    <w:p>
+      <w:pPr>
+        <w:rPr>
+          <w:lang w:val="en-GB"/>
+        </w:rPr>
+      </w:pPr>
+      <w:r>
+        <w:rPr>
+          <w:lang w:val="en-GB"/>
+        </w:rPr>
+        <w:t xml:space="preserve">Doc </w:t>
+      </w:r>
+      <w:proofErr w:type="spellStart"/>
+      <w:r>
+        <w:rPr>
+          <w:lang w:val="en-GB"/>
+        </w:rPr>
+        <w:t>JavaReentrantLock</w:t>
+      </w:r>
+      <w:proofErr w:type="spellEnd"/>
+      <w:r>
+        <w:rPr>
+          <w:lang w:val="en-GB"/>
+        </w:rPr>
+        <w:t xml:space="preserve"> </w:t>
+      </w:r>
+      <w:hyperlink r:id="rId11" w:history="1">
+        <w:r>
+          <w:rPr>
+            <w:rStyle w:val="Lienhypertexte"/>
+            <w:lang w:val="en-GB"/>
+          </w:rPr>
+          <w:t>https://docs.oracle.com/javase/8/docs/api/java/util/concurrent/locks/ReentrantLock.html</w:t>
+        </w:r>
+      </w:hyperlink>
+    </w:p>
+    <w:p>
+      <w:pPr>
+        <w:rPr>
+          <w:lang w:val="en-GB"/>
+        </w:rPr>
+      </w:pPr>
+      <w:r>
+        <w:rPr>
+          <w:lang w:val="en-GB"/>
+        </w:rPr>
+        <w:t>Doc Java JTextField</w:t>
+      </w:r>
+    </w:p>
+    <w:p>
+      <w:pPr>
+        <w:rPr>
+          <w:lang w:val="en-GB"/>
+        </w:rPr>
+      </w:pPr>
+      <w:hyperlink r:id="rId12" w:history="1">
+        <w:r>
+          <w:rPr>
+            <w:rStyle w:val="Lienhypertexte"/>
+            <w:lang w:val="en-GB"/>
+          </w:rPr>
+          <w:t>https://docs.oracle.com/javase/8/docs/api/javax/swing/JTextField.html</w:t>
+        </w:r>
+      </w:hyperlink>
+    </w:p>
+    <w:p>
+      <w:pPr>
+        <w:rPr>
+          <w:lang w:val="en-GB"/>
+        </w:rPr>
+      </w:pPr>
+      <w:r>
+        <w:rPr>
+          <w:lang w:val="en-GB"/>
+        </w:rPr>
+        <w:t xml:space="preserve">Doc Java </w:t>
+      </w:r>
+      <w:proofErr w:type="spellStart"/>
+      <w:r>
+        <w:rPr>
+          <w:lang w:val="en-GB"/>
+        </w:rPr>
+        <w:t>JTextArea</w:t>
+      </w:r>
+      <w:proofErr w:type="spellEnd"/>
+      <w:r>
+        <w:rPr>
+          <w:lang w:val="en-GB"/>
+        </w:rPr>
+        <w:t xml:space="preserve"> </w:t>
+      </w:r>
+      <w:hyperlink r:id="rId13" w:history="1">
+        <w:r>
+          <w:rPr>
+            <w:rStyle w:val="Lienhypertexte"/>
+            <w:lang w:val="en-GB"/>
+          </w:rPr>
+          <w:t>https://docs.oracle.com/javase/8/docs/api/javax/swing/JTextArea.html</w:t>
+        </w:r>
+      </w:hyperlink>
+    </w:p>
+    <w:p>
+      <w:pPr>
+        <w:rPr>
+          <w:lang w:val="en-GB"/>
+        </w:rPr>
+      </w:pPr>
+      <w:r>
+        <w:rPr>
+          <w:lang w:val="en-GB"/>
+        </w:rPr>
+        <w:t xml:space="preserve">Lab 5 Dr Daniele </w:t>
+      </w:r>
+      <w:proofErr w:type="spellStart"/>
+      <w:r>
+        <w:rPr>
+          <w:lang w:val="en-GB"/>
+        </w:rPr>
+        <w:t>Scrimieri</w:t>
+      </w:r>
+      <w:proofErr w:type="spellEnd"/>
+      <w:r>
+        <w:rPr>
+          <w:lang w:val="en-GB"/>
+        </w:rPr>
+        <w:t xml:space="preserve"> (2026) Lab 5 – Safety and Liveness </w:t>
+      </w:r>
+      <w:proofErr w:type="gramStart"/>
+      <w:r>
+        <w:rPr>
+          <w:lang w:val="en-GB"/>
+        </w:rPr>
+        <w:t>Properties :</w:t>
+      </w:r>
+      <w:proofErr w:type="gramEnd"/>
+      <w:r>
+        <w:rPr>
+          <w:lang w:val="en-GB"/>
+        </w:rPr>
+        <w:t xml:space="preserve"> Canvas</w:t>
+      </w:r>
     </w:p>
     <w:p>
       <w:pPr>

</xml_diff>